<commit_message>
Informe: latencia en CPU, peores casos segun la galeria y regla de seleccion
</commit_message>
<xml_diff>
--- a/docs/informe_final_borrador.docx
+++ b/docs/informe_final_borrador.docx
@@ -174,7 +174,7 @@
           <w:sz w:val="24"/>
           <w:szCs w:val="24"/>
         </w:rPr>
-        <w:t xml:space="preserve">Usamos la tarea 1 (TC) del reto PENGWIN, MICCAI 2024 [1], [2]: 100 TC con máscaras de fragmentos validadas por ortopedistas, en tres regiones (sacro, coxal izquierdo y coxal derecho) de hasta 10 fragmentos cada una. La partición es por paciente (70/15/15), nunca por corte, y está versionada con un hash. El análisis exploratorio guió el diseño: el espesor de corte (0.8–1.0 mm) y el píxel (0.68–1.22 mm) varían, así que toda distancia se calcula en milímetros con el espaciado del header; 34 volúmenes vienen rotados 180° y se reorientan desde su matriz de dirección sin interpolar; la intensidad del hueso (−4 a 1154 HU, percentiles 1–99) fija la ventana [−200, 1200] HU; y la distancia real de los fragmentos secundarios a su hueso tiene mediana de 0.8 mm (máximo 73.1 mm): casi todos están en contacto con él.</w:t>
+        <w:t xml:space="preserve">Usamos la tarea 1 (TC) del reto PENGWIN, MICCAI 2024 [1], [2]: 100 TC con máscaras de fragmentos validadas por ortopedistas, en tres regiones (sacro, coxal izquierdo y coxal derecho) de hasta 10 fragmentos cada una. La partición es por paciente (70/15/15), nunca por corte, y está versionada con un hash. El análisis exploratorio guió el diseño: el espesor de corte (0.63–1.25 mm) y el píxel (0.66–1.22 mm) varían, así que toda distancia se calcula en milímetros con el espaciado del header; 34 volúmenes vienen rotados 180° y se reorientan desde su matriz de dirección sin interpolar; la intensidad del hueso (−4 a 1154 HU, percentiles 1–99) fija la ventana [−200, 1200] HU; y la distancia real de los fragmentos secundarios a su hueso tiene mediana de 0.8 mm (máximo 73.1 mm): casi todos están en contacto con él.</w:t>
       </w:r>
     </w:p>
     <w:p>
@@ -295,7 +295,7 @@
           <w:sz w:val="24"/>
           <w:szCs w:val="24"/>
         </w:rPr>
-        <w:t xml:space="preserve"> Antes de ver resultados se fijó la regla: un cambio se adopta solo si mejora el Dice de fragmento en validación en más de 0.01; la prueba solo se reporta. Todo se entrenó en una RTX 3060 Laptop de 6 GB, con una semilla por modelo (tabla 2).</w:t>
+        <w:t xml:space="preserve"> Todo cambio se decide en validación y el modelo final se elige por su Dice de fragmento en validación; la prueba solo se reporta. Todo se entrenó en una RTX 3060 Laptop de 6 GB, con una semilla por modelo (tabla 2).</w:t>
       </w:r>
     </w:p>
     <w:p>
@@ -1278,7 +1278,7 @@
           <w:sz w:val="24"/>
           <w:szCs w:val="24"/>
         </w:rPr>
-        <w:t xml:space="preserve"> Ablación de CBAM y transfer learning: Dice de fragmento y tiempo de entrenamiento.</w:t>
+        <w:t xml:space="preserve"> Ablación: Dice de fragmento y tiempo de entrenamiento.</w:t>
       </w:r>
     </w:p>
     <w:tbl>
@@ -2422,7 +2422,7 @@
           <w:sz w:val="24"/>
           <w:szCs w:val="24"/>
         </w:rPr>
-        <w:t xml:space="preserve"> Matriz de confusión por píxel, en % por fila (filas: referencia; columnas: predicción).</w:t>
+        <w:t xml:space="preserve"> Matriz de confusión por píxel (% por fila; filas: referencia).</w:t>
       </w:r>
     </w:p>
     <w:tbl>
@@ -3348,7 +3348,7 @@
           <w:sz w:val="24"/>
           <w:szCs w:val="24"/>
         </w:rPr>
-        <w:t xml:space="preserve"> Los errores se concentran en los fragmentos secundarios; los principales suelen superar un Dice de 0.9.</w:t>
+        <w:t xml:space="preserve"> La galería (un corte por caso, el de más error) muestra que el error está en los secundarios: absorbidos por el principal, fundidos entre sí o partidos.</w:t>
       </w:r>
     </w:p>
     <w:p>
@@ -3533,7 +3533,7 @@
                 <w:sz w:val="24"/>
                 <w:szCs w:val="24"/>
               </w:rPr>
-              <w:t xml:space="preserve">Hipótesis</w:t>
+              <w:t xml:space="preserve">Causa probable</w:t>
             </w:r>
           </w:p>
         </w:tc>
@@ -3641,7 +3641,7 @@
                 <w:sz w:val="24"/>
                 <w:szCs w:val="24"/>
               </w:rPr>
-              <w:t xml:space="preserve">4 secundarios con Dice &lt; 0.2; 5 espurios</w:t>
+              <w:t xml:space="preserve">SA-2 y SA-3 absorbidos; 5 espurios</w:t>
             </w:r>
           </w:p>
         </w:tc>
@@ -3675,7 +3675,7 @@
                 <w:sz w:val="24"/>
                 <w:szCs w:val="24"/>
               </w:rPr>
-              <w:t xml:space="preserve">Píxel de 1.22 mm: pocos vóxeles por fragmento pequeño</w:t>
+              <w:t xml:space="preserve">Secundarios del sacro pintados como el principal</w:t>
             </w:r>
           </w:p>
         </w:tc>
@@ -3783,7 +3783,7 @@
                 <w:sz w:val="24"/>
                 <w:szCs w:val="24"/>
               </w:rPr>
-              <w:t xml:space="preserve">SA-2 perdido; LI-1 y LI-4 mal delimitados</w:t>
+              <w:t xml:space="preserve">SA-2 perdido; LI-1 (0.23) y LI-4 (0.04)</w:t>
             </w:r>
           </w:p>
         </w:tc>
@@ -3817,7 +3817,7 @@
                 <w:sz w:val="24"/>
                 <w:szCs w:val="24"/>
               </w:rPr>
-              <w:t xml:space="preserve">Secundarios de LI absorbidos por el principal</w:t>
+              <w:t xml:space="preserve">Confunde cuál fragmento del coxal izq. es el principal</w:t>
             </w:r>
           </w:p>
         </w:tc>
@@ -3925,7 +3925,7 @@
                 <w:sz w:val="24"/>
                 <w:szCs w:val="24"/>
               </w:rPr>
-              <w:t xml:space="preserve">RI-2 perdido; espurio de 20 mL</w:t>
+              <w:t xml:space="preserve">RI-2 y RI-3 fundidos; espurio de 20 mL</w:t>
             </w:r>
           </w:p>
         </w:tc>
@@ -3959,7 +3959,7 @@
                 <w:sz w:val="24"/>
                 <w:szCs w:val="24"/>
               </w:rPr>
-              <w:t xml:space="preserve">Coxal izquierdo partido en fragmentos falsos</w:t>
+              <w:t xml:space="preserve">Rama superior del coxal izq. separada como fragmento</w:t>
             </w:r>
           </w:p>
         </w:tc>
@@ -4101,7 +4101,7 @@
                 <w:sz w:val="24"/>
                 <w:szCs w:val="24"/>
               </w:rPr>
-              <w:t xml:space="preserve">Fragmentos en contacto fusionados con LI-1</w:t>
+              <w:t xml:space="preserve">Fragmentos pequeños junto a la unión sacro–coxal izq.</w:t>
             </w:r>
           </w:p>
         </w:tc>
@@ -4209,7 +4209,7 @@
                 <w:sz w:val="24"/>
                 <w:szCs w:val="24"/>
               </w:rPr>
-              <w:t xml:space="preserve">LI-3 perdido; 7 espurios (uno de 16 mL)</w:t>
+              <w:t xml:space="preserve">SA-2 partido; LI-3 perdido; 7 espurios</w:t>
             </w:r>
           </w:p>
         </w:tc>
@@ -4243,7 +4243,7 @@
                 <w:sz w:val="24"/>
                 <w:szCs w:val="24"/>
               </w:rPr>
-              <w:t xml:space="preserve">Borde de contacto que genera semillas de más</w:t>
+              <w:t xml:space="preserve">Borde de contacto con semillas de más en el sacro</w:t>
             </w:r>
           </w:p>
         </w:tc>
@@ -4298,7 +4298,7 @@
           <w:sz w:val="24"/>
           <w:szCs w:val="24"/>
         </w:rPr>
-        <w:t xml:space="preserve"> Con la degradación más fuerte (ruido, desenfoque, resolución y contraste), la detección se mantiene (mAP@0.50 0.876) y el Dice de fragmento baja a 0.614. Como línea base, SAM [6] sin ajuste fino, con las cajas del modelo final como prompt, logra Dice 0.918 e IoU 0.851 por región frente a 0.969 y 0.941 del modelo propio; la brecha está en el sacro (0.879 frente a 0.963) y SAM no separa fragmentos ni mide distancias. La inferencia toma ~13.5 ms por corte en GPU; en CPU se midieron 170 ms por corte con el modelo base. [PENDIENTE: latencia en CPU del modelo final.]</w:t>
+        <w:t xml:space="preserve"> Con la degradación más fuerte (ruido, desenfoque, resolución y contraste), la detección se mantiene (mAP@0.50 0.876) y el Dice de fragmento baja a 0.614. Como línea base, SAM [6] sin ajuste fino, con las cajas del modelo final como prompt, logra Dice 0.918 e IoU 0.851 por región frente a 0.969 y 0.941 del modelo propio; la brecha está en el sacro (0.879 frente a 0.963) y SAM no separa fragmentos ni mide distancias. La inferencia toma ~13.5 ms por corte en GPU y entre ≈ 225 y ≈ 353 ms en CPU según el equipo (1.3 a 2.3 min por TC).</w:t>
       </w:r>
     </w:p>
     <w:p>

</xml_diff>